<commit_message>
Detalha o passo a passo da chave de API na documentação
A seção 4.3 passa a cobrir o fluxo real do Google AI Studio, tela a tela, e
ganha uma tabela de problemas comuns — inclusive o mais frequente num
trabalho escolar: contas de menores de idade e contas Workspace for
Education têm o AI Studio bloqueado pelo administrador, e o botão de criar
chave nem aparece. Não há contorno pelo código, então isso precisa estar
escrito antes de alguém travar na véspera.

Também documenta os cuidados com a chave e o que fazer se ela vazar.
README atualizado com a versão curta do mesmo conteúdo.
</commit_message>
<xml_diff>
--- a/atividades/oraculo-ck/documentacao-oraculo-ck.docx
+++ b/atividades/oraculo-ck/documentacao-oraculo-ck.docx
@@ -6017,6 +6017,35 @@
     </w:p>
     <w:p>
       <w:pPr>
+        <w:spacing w:after="120" w:before="0" w:line="276"/>
+      </w:pPr>
+      <w:r>
+        <w:rPr>
+          <w:color w:val="12241D"/>
+          <w:sz w:val="21"/>
+          <w:szCs w:val="21"/>
+        </w:rPr>
+        <w:t xml:space="preserve">A chave é gratuita e leva cerca de dois minutos. Ela é pessoal: uma só já atende o grupo inteiro durante a apresentação.</w:t>
+      </w:r>
+    </w:p>
+    <w:p>
+      <w:pPr>
+        <w:pStyle w:val="Heading3"/>
+        <w:spacing w:after="100" w:before="200"/>
+      </w:pPr>
+      <w:r>
+        <w:rPr>
+          <w:b/>
+          <w:bCs/>
+          <w:color w:val="12241D"/>
+          <w:sz w:val="21"/>
+          <w:szCs w:val="21"/>
+        </w:rPr>
+        <w:t xml:space="preserve">Passo a passo</w:t>
+      </w:r>
+    </w:p>
+    <w:p>
+      <w:pPr>
         <w:pStyle w:val="ListParagraph"/>
         <w:numPr>
           <w:ilvl w:val="0"/>
@@ -6030,7 +6059,7 @@
           <w:sz w:val="21"/>
           <w:szCs w:val="21"/>
         </w:rPr>
-        <w:t xml:space="preserve">Acesse </w:t>
+        <w:t xml:space="preserve">Abra </w:t>
       </w:r>
       <w:r>
         <w:rPr>
@@ -6039,15 +6068,15 @@
           <w:sz w:val="19"/>
           <w:szCs w:val="19"/>
         </w:rPr>
-        <w:t xml:space="preserve">https://aistudio.google.com/app/apikey</w:t>
-      </w:r>
-      <w:r>
-        <w:rPr>
-          <w:color w:val="12241D"/>
-          <w:sz w:val="21"/>
-          <w:szCs w:val="21"/>
-        </w:rPr>
-        <w:t xml:space="preserve"> e entre com uma conta Google.</w:t>
+        <w:t xml:space="preserve">aistudio.google.com/app/apikey</w:t>
+      </w:r>
+      <w:r>
+        <w:rPr>
+          <w:color w:val="12241D"/>
+          <w:sz w:val="21"/>
+          <w:szCs w:val="21"/>
+        </w:rPr>
+        <w:t xml:space="preserve"> no navegador.</w:t>
       </w:r>
     </w:p>
     <w:p>
@@ -6061,29 +6090,21 @@
       </w:pPr>
       <w:r>
         <w:rPr>
-          <w:color w:val="12241D"/>
-          <w:sz w:val="21"/>
-          <w:szCs w:val="21"/>
-        </w:rPr>
-        <w:t xml:space="preserve">Clique em </w:t>
-      </w:r>
-      <w:r>
-        <w:rPr>
           <w:b/>
           <w:bCs/>
           <w:color w:val="12241D"/>
           <w:sz w:val="21"/>
           <w:szCs w:val="21"/>
         </w:rPr>
-        <w:t xml:space="preserve">Create API key</w:t>
-      </w:r>
-      <w:r>
-        <w:rPr>
-          <w:color w:val="12241D"/>
-          <w:sz w:val="21"/>
-          <w:szCs w:val="21"/>
-        </w:rPr>
-        <w:t xml:space="preserve"> (ou "Criar chave de API").</w:t>
+        <w:t xml:space="preserve">Entre com uma conta Google. </w:t>
+      </w:r>
+      <w:r>
+        <w:rPr>
+          <w:color w:val="12241D"/>
+          <w:sz w:val="21"/>
+          <w:szCs w:val="21"/>
+        </w:rPr>
+        <w:t xml:space="preserve">Na primeira vez, o Google AI Studio pede para aceitar os termos de uso — marque a caixa e confirme.</w:t>
       </w:r>
     </w:p>
     <w:p>
@@ -6101,7 +6122,25 @@
           <w:sz w:val="21"/>
           <w:szCs w:val="21"/>
         </w:rPr>
-        <w:t xml:space="preserve">Escolha um projeto quando for solicitado — pode ser o projeto padrão.</w:t>
+        <w:t xml:space="preserve">Clique no botão </w:t>
+      </w:r>
+      <w:r>
+        <w:rPr>
+          <w:b/>
+          <w:bCs/>
+          <w:color w:val="12241D"/>
+          <w:sz w:val="21"/>
+          <w:szCs w:val="21"/>
+        </w:rPr>
+        <w:t xml:space="preserve">Create API key</w:t>
+      </w:r>
+      <w:r>
+        <w:rPr>
+          <w:color w:val="12241D"/>
+          <w:sz w:val="21"/>
+          <w:szCs w:val="21"/>
+        </w:rPr>
+        <w:t xml:space="preserve"> (em português, "Criar chave de API"), no canto superior direito da lista de chaves.</w:t>
       </w:r>
     </w:p>
     <w:p>
@@ -6115,11 +6154,67 @@
       </w:pPr>
       <w:r>
         <w:rPr>
-          <w:color w:val="12241D"/>
-          <w:sz w:val="21"/>
-          <w:szCs w:val="21"/>
-        </w:rPr>
-        <w:t xml:space="preserve">Copie a chave gerada. Ela começa com </w:t>
+          <w:b/>
+          <w:bCs/>
+          <w:color w:val="12241D"/>
+          <w:sz w:val="21"/>
+          <w:szCs w:val="21"/>
+        </w:rPr>
+        <w:t xml:space="preserve">Escolha o projeto. </w:t>
+      </w:r>
+      <w:r>
+        <w:rPr>
+          <w:color w:val="12241D"/>
+          <w:sz w:val="21"/>
+          <w:szCs w:val="21"/>
+        </w:rPr>
+        <w:t xml:space="preserve">Aparece uma caixa perguntando em qual projeto do Google Cloud criar a chave. Se você nunca usou, escolha </w:t>
+      </w:r>
+      <w:r>
+        <w:rPr>
+          <w:i/>
+          <w:iCs/>
+          <w:color w:val="12241D"/>
+          <w:sz w:val="21"/>
+          <w:szCs w:val="21"/>
+        </w:rPr>
+        <w:t xml:space="preserve">Create API key in new project</w:t>
+      </w:r>
+      <w:r>
+        <w:rPr>
+          <w:color w:val="12241D"/>
+          <w:sz w:val="21"/>
+          <w:szCs w:val="21"/>
+        </w:rPr>
+        <w:t xml:space="preserve"> — o projeto é criado sozinho e não custa nada.</w:t>
+      </w:r>
+    </w:p>
+    <w:p>
+      <w:pPr>
+        <w:pStyle w:val="ListParagraph"/>
+        <w:numPr>
+          <w:ilvl w:val="0"/>
+          <w:numId w:val="3"/>
+        </w:numPr>
+        <w:spacing w:after="80" w:line="264"/>
+      </w:pPr>
+      <w:r>
+        <w:rPr>
+          <w:b/>
+          <w:bCs/>
+          <w:color w:val="12241D"/>
+          <w:sz w:val="21"/>
+          <w:szCs w:val="21"/>
+        </w:rPr>
+        <w:t xml:space="preserve">Copie a chave. </w:t>
+      </w:r>
+      <w:r>
+        <w:rPr>
+          <w:color w:val="12241D"/>
+          <w:sz w:val="21"/>
+          <w:szCs w:val="21"/>
+        </w:rPr>
+        <w:t xml:space="preserve">Ela aparece uma vez, começa com </w:t>
       </w:r>
       <w:r>
         <w:rPr>
@@ -6136,9 +6231,470 @@
           <w:sz w:val="21"/>
           <w:szCs w:val="21"/>
         </w:rPr>
-        <w:t xml:space="preserve"> e tem por volta de 39 caracteres.</w:t>
-      </w:r>
-    </w:p>
+        <w:t xml:space="preserve"> e tem cerca de 39 caracteres. Use o botão de copiar ao lado dela.</w:t>
+      </w:r>
+    </w:p>
+    <w:p>
+      <w:pPr>
+        <w:pStyle w:val="ListParagraph"/>
+        <w:numPr>
+          <w:ilvl w:val="0"/>
+          <w:numId w:val="3"/>
+        </w:numPr>
+        <w:spacing w:after="80" w:line="264"/>
+      </w:pPr>
+      <w:r>
+        <w:rPr>
+          <w:b/>
+          <w:bCs/>
+          <w:color w:val="12241D"/>
+          <w:sz w:val="21"/>
+          <w:szCs w:val="21"/>
+        </w:rPr>
+        <w:t xml:space="preserve">Cole na aplicação, </w:t>
+      </w:r>
+      <w:r>
+        <w:rPr>
+          <w:color w:val="12241D"/>
+          <w:sz w:val="21"/>
+          <w:szCs w:val="21"/>
+        </w:rPr>
+        <w:t xml:space="preserve">seguindo a Forma 1 da seção 4.4. Pronto.</w:t>
+      </w:r>
+    </w:p>
+    <w:p>
+      <w:pPr>
+        <w:pStyle w:val="Heading3"/>
+        <w:spacing w:after="100" w:before="200"/>
+      </w:pPr>
+      <w:r>
+        <w:rPr>
+          <w:b/>
+          <w:bCs/>
+          <w:color w:val="12241D"/>
+          <w:sz w:val="21"/>
+          <w:szCs w:val="21"/>
+        </w:rPr>
+        <w:t xml:space="preserve">Se algo não sair como o esperado</w:t>
+      </w:r>
+    </w:p>
+    <w:tbl>
+      <w:tblPr>
+        <w:tblW w:type="dxa" w:w="9638"/>
+        <w:tblBorders>
+          <w:top w:val="single" w:color="C8E3D8" w:sz="2"/>
+          <w:left w:val="single" w:color="C8E3D8" w:sz="2"/>
+          <w:bottom w:val="single" w:color="C8E3D8" w:sz="2"/>
+          <w:right w:val="single" w:color="C8E3D8" w:sz="2"/>
+          <w:insideH w:val="single" w:color="DCECE6" w:sz="2"/>
+          <w:insideV w:val="single" w:color="DCECE6" w:sz="2"/>
+        </w:tblBorders>
+      </w:tblPr>
+      <w:tblGrid>
+        <w:gridCol w:w="3000"/>
+        <w:gridCol w:w="6638"/>
+      </w:tblGrid>
+      <w:tr>
+        <w:trPr>
+          <w:tblHeader/>
+        </w:trPr>
+        <w:tc>
+          <w:tcPr>
+            <w:tcW w:type="dxa" w:w="3000"/>
+            <w:shd w:fill="0B6B4A" w:color="auto" w:val="clear"/>
+            <w:tcMar>
+              <w:top w:type="dxa" w:w="90"/>
+              <w:left w:type="dxa" w:w="130"/>
+              <w:bottom w:type="dxa" w:w="90"/>
+              <w:right w:type="dxa" w:w="130"/>
+            </w:tcMar>
+            <w:vAlign w:val="center"/>
+          </w:tcPr>
+          <w:p>
+            <w:pPr>
+              <w:spacing w:after="0" w:line="252"/>
+            </w:pPr>
+            <w:r>
+              <w:rPr>
+                <w:b/>
+                <w:bCs/>
+                <w:color w:val="FFFFFF"/>
+                <w:sz w:val="18"/>
+                <w:szCs w:val="18"/>
+              </w:rPr>
+              <w:t xml:space="preserve">O que aparece</w:t>
+            </w:r>
+          </w:p>
+        </w:tc>
+        <w:tc>
+          <w:tcPr>
+            <w:tcW w:type="dxa" w:w="6638"/>
+            <w:shd w:fill="0B6B4A" w:color="auto" w:val="clear"/>
+            <w:tcMar>
+              <w:top w:type="dxa" w:w="90"/>
+              <w:left w:type="dxa" w:w="130"/>
+              <w:bottom w:type="dxa" w:w="90"/>
+              <w:right w:type="dxa" w:w="130"/>
+            </w:tcMar>
+            <w:vAlign w:val="center"/>
+          </w:tcPr>
+          <w:p>
+            <w:pPr>
+              <w:spacing w:after="0" w:line="252"/>
+            </w:pPr>
+            <w:r>
+              <w:rPr>
+                <w:b/>
+                <w:bCs/>
+                <w:color w:val="FFFFFF"/>
+                <w:sz w:val="18"/>
+                <w:szCs w:val="18"/>
+              </w:rPr>
+              <w:t xml:space="preserve">O que fazer</w:t>
+            </w:r>
+          </w:p>
+        </w:tc>
+      </w:tr>
+      <w:tr>
+        <w:tc>
+          <w:tcPr>
+            <w:tcW w:type="dxa" w:w="3000"/>
+            <w:tcMar>
+              <w:top w:type="dxa" w:w="90"/>
+              <w:left w:type="dxa" w:w="130"/>
+              <w:bottom w:type="dxa" w:w="90"/>
+              <w:right w:type="dxa" w:w="130"/>
+            </w:tcMar>
+            <w:vAlign w:val="center"/>
+          </w:tcPr>
+          <w:p>
+            <w:pPr>
+              <w:spacing w:after="0" w:line="252"/>
+            </w:pPr>
+            <w:r>
+              <w:rPr>
+                <w:color w:val="12241D"/>
+                <w:sz w:val="19"/>
+                <w:szCs w:val="19"/>
+              </w:rPr>
+              <w:t xml:space="preserve">A página não deixa criar a chave, ou some o botão</w:t>
+            </w:r>
+          </w:p>
+        </w:tc>
+        <w:tc>
+          <w:tcPr>
+            <w:tcW w:type="dxa" w:w="6638"/>
+            <w:tcMar>
+              <w:top w:type="dxa" w:w="90"/>
+              <w:left w:type="dxa" w:w="130"/>
+              <w:bottom w:type="dxa" w:w="90"/>
+              <w:right w:type="dxa" w:w="130"/>
+            </w:tcMar>
+            <w:vAlign w:val="center"/>
+          </w:tcPr>
+          <w:p>
+            <w:pPr>
+              <w:spacing w:after="0" w:line="252"/>
+            </w:pPr>
+            <w:r>
+              <w:rPr>
+                <w:color w:val="12241D"/>
+                <w:sz w:val="19"/>
+                <w:szCs w:val="19"/>
+              </w:rPr>
+              <w:t xml:space="preserve">Contas de menores de idade e contas escolares (Google Workspace for Education) costumam ter o AI Studio bloqueado pelo administrador. Use uma conta Google pessoal de alguém com 18 anos ou mais — é a causa mais comum, e não há como contornar pela aplicação.</w:t>
+            </w:r>
+          </w:p>
+        </w:tc>
+      </w:tr>
+      <w:tr>
+        <w:tc>
+          <w:tcPr>
+            <w:tcW w:type="dxa" w:w="3000"/>
+            <w:shd w:fill="F6FBF9" w:color="auto" w:val="clear"/>
+            <w:tcMar>
+              <w:top w:type="dxa" w:w="90"/>
+              <w:left w:type="dxa" w:w="130"/>
+              <w:bottom w:type="dxa" w:w="90"/>
+              <w:right w:type="dxa" w:w="130"/>
+            </w:tcMar>
+            <w:vAlign w:val="center"/>
+          </w:tcPr>
+          <w:p>
+            <w:pPr>
+              <w:spacing w:after="0" w:line="252"/>
+            </w:pPr>
+            <w:r>
+              <w:rPr>
+                <w:color w:val="12241D"/>
+                <w:sz w:val="19"/>
+                <w:szCs w:val="19"/>
+              </w:rPr>
+              <w:t xml:space="preserve">"You must be 18 or older" ou aviso de idade</w:t>
+            </w:r>
+          </w:p>
+        </w:tc>
+        <w:tc>
+          <w:tcPr>
+            <w:tcW w:type="dxa" w:w="6638"/>
+            <w:shd w:fill="F6FBF9" w:color="auto" w:val="clear"/>
+            <w:tcMar>
+              <w:top w:type="dxa" w:w="90"/>
+              <w:left w:type="dxa" w:w="130"/>
+              <w:bottom w:type="dxa" w:w="90"/>
+              <w:right w:type="dxa" w:w="130"/>
+            </w:tcMar>
+            <w:vAlign w:val="center"/>
+          </w:tcPr>
+          <w:p>
+            <w:pPr>
+              <w:spacing w:after="0" w:line="252"/>
+            </w:pPr>
+            <w:r>
+              <w:rPr>
+                <w:color w:val="12241D"/>
+                <w:sz w:val="19"/>
+                <w:szCs w:val="19"/>
+              </w:rPr>
+              <w:t xml:space="preserve">Mesma causa acima: a conta está registrada como de menor de idade. Use outra conta Google.</w:t>
+            </w:r>
+          </w:p>
+        </w:tc>
+      </w:tr>
+      <w:tr>
+        <w:tc>
+          <w:tcPr>
+            <w:tcW w:type="dxa" w:w="3000"/>
+            <w:tcMar>
+              <w:top w:type="dxa" w:w="90"/>
+              <w:left w:type="dxa" w:w="130"/>
+              <w:bottom w:type="dxa" w:w="90"/>
+              <w:right w:type="dxa" w:w="130"/>
+            </w:tcMar>
+            <w:vAlign w:val="center"/>
+          </w:tcPr>
+          <w:p>
+            <w:pPr>
+              <w:spacing w:after="0" w:line="252"/>
+            </w:pPr>
+            <w:r>
+              <w:rPr>
+                <w:color w:val="12241D"/>
+                <w:sz w:val="19"/>
+                <w:szCs w:val="19"/>
+              </w:rPr>
+              <w:t xml:space="preserve">A chave é criada mas o app diz "Chave não autorizada"</w:t>
+            </w:r>
+          </w:p>
+        </w:tc>
+        <w:tc>
+          <w:tcPr>
+            <w:tcW w:type="dxa" w:w="6638"/>
+            <w:tcMar>
+              <w:top w:type="dxa" w:w="90"/>
+              <w:left w:type="dxa" w:w="130"/>
+              <w:bottom w:type="dxa" w:w="90"/>
+              <w:right w:type="dxa" w:w="130"/>
+            </w:tcMar>
+            <w:vAlign w:val="center"/>
+          </w:tcPr>
+          <w:p>
+            <w:pPr>
+              <w:spacing w:after="0" w:line="252"/>
+            </w:pPr>
+            <w:r>
+              <w:rPr>
+                <w:color w:val="12241D"/>
+                <w:sz w:val="19"/>
+                <w:szCs w:val="19"/>
+              </w:rPr>
+              <w:t xml:space="preserve">Confira se a chave foi colada inteira, sem espaço no começo ou no fim. Se persistir, apague a chave no AI Studio e crie outra.</w:t>
+            </w:r>
+          </w:p>
+        </w:tc>
+      </w:tr>
+      <w:tr>
+        <w:tc>
+          <w:tcPr>
+            <w:tcW w:type="dxa" w:w="3000"/>
+            <w:shd w:fill="F6FBF9" w:color="auto" w:val="clear"/>
+            <w:tcMar>
+              <w:top w:type="dxa" w:w="90"/>
+              <w:left w:type="dxa" w:w="130"/>
+              <w:bottom w:type="dxa" w:w="90"/>
+              <w:right w:type="dxa" w:w="130"/>
+            </w:tcMar>
+            <w:vAlign w:val="center"/>
+          </w:tcPr>
+          <w:p>
+            <w:pPr>
+              <w:spacing w:after="0" w:line="252"/>
+            </w:pPr>
+            <w:r>
+              <w:rPr>
+                <w:color w:val="12241D"/>
+                <w:sz w:val="19"/>
+                <w:szCs w:val="19"/>
+              </w:rPr>
+              <w:t xml:space="preserve">"Limite de uso atingido" (HTTP 429)</w:t>
+            </w:r>
+          </w:p>
+        </w:tc>
+        <w:tc>
+          <w:tcPr>
+            <w:tcW w:type="dxa" w:w="6638"/>
+            <w:shd w:fill="F6FBF9" w:color="auto" w:val="clear"/>
+            <w:tcMar>
+              <w:top w:type="dxa" w:w="90"/>
+              <w:left w:type="dxa" w:w="130"/>
+              <w:bottom w:type="dxa" w:w="90"/>
+              <w:right w:type="dxa" w:w="130"/>
+            </w:tcMar>
+            <w:vAlign w:val="center"/>
+          </w:tcPr>
+          <w:p>
+            <w:pPr>
+              <w:spacing w:after="0" w:line="252"/>
+            </w:pPr>
+            <w:r>
+              <w:rPr>
+                <w:color w:val="12241D"/>
+                <w:sz w:val="19"/>
+                <w:szCs w:val="19"/>
+              </w:rPr>
+              <w:t xml:space="preserve">A camada gratuita tem limite de requisições por minuto e por dia. Espere alguns minutos. Durante a apresentação, o modo demonstração assume sem quebrar nada.</w:t>
+            </w:r>
+          </w:p>
+        </w:tc>
+      </w:tr>
+      <w:tr>
+        <w:tc>
+          <w:tcPr>
+            <w:tcW w:type="dxa" w:w="3000"/>
+            <w:tcMar>
+              <w:top w:type="dxa" w:w="90"/>
+              <w:left w:type="dxa" w:w="130"/>
+              <w:bottom w:type="dxa" w:w="90"/>
+              <w:right w:type="dxa" w:w="130"/>
+            </w:tcMar>
+            <w:vAlign w:val="center"/>
+          </w:tcPr>
+          <w:p>
+            <w:pPr>
+              <w:spacing w:after="0" w:line="252"/>
+            </w:pPr>
+            <w:r>
+              <w:rPr>
+                <w:color w:val="12241D"/>
+                <w:sz w:val="19"/>
+                <w:szCs w:val="19"/>
+              </w:rPr>
+              <w:t xml:space="preserve">A rede da escola bloqueia a API</w:t>
+            </w:r>
+          </w:p>
+        </w:tc>
+        <w:tc>
+          <w:tcPr>
+            <w:tcW w:type="dxa" w:w="6638"/>
+            <w:tcMar>
+              <w:top w:type="dxa" w:w="90"/>
+              <w:left w:type="dxa" w:w="130"/>
+              <w:bottom w:type="dxa" w:w="90"/>
+              <w:right w:type="dxa" w:w="130"/>
+            </w:tcMar>
+            <w:vAlign w:val="center"/>
+          </w:tcPr>
+          <w:p>
+            <w:pPr>
+              <w:spacing w:after="0" w:line="252"/>
+            </w:pPr>
+            <w:r>
+              <w:rPr>
+                <w:color w:val="12241D"/>
+                <w:sz w:val="19"/>
+                <w:szCs w:val="19"/>
+              </w:rPr>
+              <w:t xml:space="preserve">Nada a fazer no código: firewalls escolares às vezes barram domínios do Google. Apresente pelo celular com dados móveis, ou use o modo demonstração.</w:t>
+            </w:r>
+          </w:p>
+        </w:tc>
+      </w:tr>
+    </w:tbl>
+    <w:tbl>
+      <w:tblPr>
+        <w:tblW w:type="dxa" w:w="9638"/>
+        <w:tblBorders>
+          <w:top w:val="single" w:color="12B57C" w:sz="4"/>
+          <w:left w:val="single" w:color="12B57C" w:sz="16"/>
+          <w:bottom w:val="single" w:color="12B57C" w:sz="4"/>
+          <w:right w:val="single" w:color="12B57C" w:sz="4"/>
+          <w:insideH w:val="none"/>
+          <w:insideV w:val="none"/>
+        </w:tblBorders>
+      </w:tblPr>
+      <w:tblGrid>
+        <w:gridCol w:w="9638"/>
+      </w:tblGrid>
+      <w:tr>
+        <w:tc>
+          <w:tcPr>
+            <w:tcW w:type="dxa" w:w="9638"/>
+            <w:shd w:fill="E8F7F0" w:color="auto" w:val="clear"/>
+            <w:tcMar>
+              <w:top w:type="dxa" w:w="140"/>
+              <w:left w:type="dxa" w:w="200"/>
+              <w:bottom w:type="dxa" w:w="140"/>
+              <w:right w:type="dxa" w:w="160"/>
+            </w:tcMar>
+          </w:tcPr>
+          <w:p>
+            <w:pPr>
+              <w:spacing w:after="60"/>
+            </w:pPr>
+            <w:r>
+              <w:rPr>
+                <w:b/>
+                <w:bCs/>
+                <w:color w:val="0B6B4A"/>
+                <w:sz w:val="20"/>
+                <w:szCs w:val="20"/>
+              </w:rPr>
+              <w:t xml:space="preserve">Cuidados com a chave</w:t>
+            </w:r>
+          </w:p>
+          <w:p>
+            <w:pPr>
+              <w:spacing w:after="0" w:line="264"/>
+            </w:pPr>
+            <w:r>
+              <w:rPr>
+                <w:color w:val="12241D"/>
+                <w:sz w:val="20"/>
+                <w:szCs w:val="20"/>
+              </w:rPr>
+              <w:t xml:space="preserve">A chave é como uma senha: quem a tiver pode gastar a sua cota. Não a publique no GitHub, não a mostre em slide e não a deixe em </w:t>
+            </w:r>
+            <w:r>
+              <w:rPr>
+                <w:rFonts w:ascii="Consolas" w:cs="Consolas" w:eastAsia="Consolas" w:hAnsi="Consolas"/>
+                <w:color w:val="0B6B4A"/>
+                <w:sz w:val="19"/>
+                <w:szCs w:val="19"/>
+              </w:rPr>
+              <w:t xml:space="preserve">config.js</w:t>
+            </w:r>
+            <w:r>
+              <w:rPr>
+                <w:color w:val="12241D"/>
+                <w:sz w:val="20"/>
+                <w:szCs w:val="20"/>
+              </w:rPr>
+              <w:t xml:space="preserve"> numa cópia que vá para o repositório. Se ela vazar, apague-a no AI Studio e crie outra — leva dez segundos e a antiga para de funcionar na hora.</w:t>
+            </w:r>
+          </w:p>
+        </w:tc>
+      </w:tr>
+    </w:tbl>
     <w:p>
       <w:pPr>
         <w:pStyle w:val="Heading2"/>

</xml_diff>